<commit_message>
Redraw ROC curve: clean IEEE publication-grade benchmark with inset zoom
</commit_message>
<xml_diff>
--- a/Research_Paper_Final_Draft_IEEE.docx
+++ b/Research_Paper_Final_Draft_IEEE.docx
@@ -3126,7 +3126,7 @@
       <w:r>
         <w:drawing>
           <wp:inline xmlns:a="http://schemas.openxmlformats.org/drawingml/2006/main" xmlns:pic="http://schemas.openxmlformats.org/drawingml/2006/picture">
-            <wp:extent cx="5029200" cy="17737031"/>
+            <wp:extent cx="5029200" cy="4185089"/>
             <wp:docPr id="3" name="Picture 3"/>
             <wp:cNvGraphicFramePr>
               <a:graphicFrameLocks noChangeAspect="1"/>
@@ -3147,7 +3147,7 @@
                   <pic:spPr>
                     <a:xfrm>
                       <a:off x="0" y="0"/>
-                      <a:ext cx="5029200" cy="17737031"/>
+                      <a:ext cx="5029200" cy="4185089"/>
                     </a:xfrm>
                     <a:prstGeom prst="rect"/>
                   </pic:spPr>

</xml_diff>